<commit_message>
Commit Versão final Doc AWS
</commit_message>
<xml_diff>
--- a/docs/trabalho-aws-abnt.docx
+++ b/docs/trabalho-aws-abnt.docx
@@ -141,59 +141,35 @@
         <w:rPr>
           <w:rFonts w:cs="Arial"/>
         </w:rPr>
-        <w:t xml:space="preserve"> aplicação Cloud Commerce </w:t>
-      </w:r>
+        <w:t xml:space="preserve"> aplicação Cloud Commerce em ambiente AWS, utilizando Docker, Amazon ECR e Amazon EKS. O projeto original possui front-end, microsserviços e mensageria, porém, para esta etapa, foi escolhido o front cloud-commerce </w:t>
+      </w:r>
+      <w:proofErr w:type="gramStart"/>
       <w:r>
         <w:rPr>
           <w:rFonts w:cs="Arial"/>
         </w:rPr>
-        <w:t xml:space="preserve">em ambiente AWS, utilizando Docker, Amazon ECR e Amazon EKS. O projeto original possui front-end, microsserviços e mensageria, porém, para esta etapa, foi escolhido o front cloud-commerce </w:t>
+        <w:t>como</w:t>
+      </w:r>
+      <w:proofErr w:type="gramEnd"/>
+      <w:r>
+        <w:rPr>
+          <w:rFonts w:cs="Arial"/>
+        </w:rPr>
+        <w:t xml:space="preserve"> aplicação principal de demonstração. A partir dele foi criado o arquivo Dockerfile, gerada uma imagem local com tag v1, publicada </w:t>
       </w:r>
       <w:proofErr w:type="gramStart"/>
       <w:r>
         <w:rPr>
           <w:rFonts w:cs="Arial"/>
         </w:rPr>
-        <w:t>como</w:t>
+        <w:t>a</w:t>
       </w:r>
       <w:proofErr w:type="gramEnd"/>
       <w:r>
         <w:rPr>
           <w:rFonts w:cs="Arial"/>
         </w:rPr>
-        <w:t xml:space="preserve"> aplicação principal de demonstração. A partir dele foi criado o</w:t>
-      </w:r>
-      <w:r>
-        <w:rPr>
-          <w:rFonts w:cs="Arial"/>
-        </w:rPr>
-        <w:t xml:space="preserve"> arquivo Dockerfile, gerada uma imagem local com tag v1, publicada </w:t>
-      </w:r>
-      <w:proofErr w:type="gramStart"/>
-      <w:r>
-        <w:rPr>
-          <w:rFonts w:cs="Arial"/>
-        </w:rPr>
-        <w:t>a</w:t>
-      </w:r>
-      <w:proofErr w:type="gramEnd"/>
-      <w:r>
-        <w:rPr>
-          <w:rFonts w:cs="Arial"/>
-        </w:rPr>
-        <w:t xml:space="preserve"> imagem no Amazon ECR e criado um cluster Kubernetes no Amazon EKS. Em seguida, foram aplicados manifestos YAML de ConfigMap, Secret, Deployment e Service, permitindo executar duas réplica</w:t>
-      </w:r>
-      <w:r>
-        <w:rPr>
-          <w:rFonts w:cs="Arial"/>
-        </w:rPr>
-        <w:t>s da aplicação e expô-la por meio de um LoadBalancer. Os testes realizados demonstraram acesso externo, leitura de variáveis de ambiente e recuperação automática de Pod, atendendo ao objetivo de compreender o fluxo entre aplicação, container, registro de i</w:t>
-      </w:r>
-      <w:r>
-        <w:rPr>
-          <w:rFonts w:cs="Arial"/>
-        </w:rPr>
-        <w:t>magem e orquestração em nuvem.</w:t>
+        <w:t xml:space="preserve"> imagem no Amazon ECR e criado um cluster Kubernetes no Amazon EKS. Em seguida, foram aplicados manifestos YAML de ConfigMap, Secret, Deployment e Service, permitindo executar duas réplicas da aplicação e expô-la por meio de um LoadBalancer. Os testes realizados demonstraram acesso externo, leitura de variáveis de ambiente e recuperação automática de Pod, atendendo ao objetivo de compreender o fluxo entre aplicação, container, registro de imagem e orquestração em nuvem.</w:t>
       </w:r>
     </w:p>
     <w:p>
@@ -237,67 +213,49 @@
         <w:rPr>
           <w:rFonts w:cs="Arial"/>
         </w:rPr>
-        <w:t>This report presents the process used to containerize and deploy the Cloud Commerce application on AWS using Docker, Amazon ECR</w:t>
-      </w:r>
+        <w:t xml:space="preserve">This report presents the process used to containerize and deploy the Cloud Commerce application on AWS using Docker, Amazon ECR and Amazon EKS. The original project includes a front end, microservices and messaging, but for this </w:t>
+      </w:r>
+      <w:proofErr w:type="gramStart"/>
       <w:r>
         <w:rPr>
           <w:rFonts w:cs="Arial"/>
         </w:rPr>
-        <w:t xml:space="preserve"> and Amazon EKS. The original project includes a front end, microservices and messaging, but for this </w:t>
+        <w:t>stage</w:t>
+      </w:r>
+      <w:proofErr w:type="gramEnd"/>
+      <w:r>
+        <w:rPr>
+          <w:rFonts w:cs="Arial"/>
+        </w:rPr>
+        <w:t xml:space="preserve"> the cloud-commerce front end was selected as the main demonstration application. A Dockerfile </w:t>
       </w:r>
       <w:proofErr w:type="gramStart"/>
       <w:r>
         <w:rPr>
           <w:rFonts w:cs="Arial"/>
         </w:rPr>
-        <w:t>stage</w:t>
+        <w:t>was created</w:t>
       </w:r>
       <w:proofErr w:type="gramEnd"/>
       <w:r>
         <w:rPr>
           <w:rFonts w:cs="Arial"/>
         </w:rPr>
-        <w:t xml:space="preserve"> the cloud-commerce front end was selected as the main demonstration application. A Dockerfile </w:t>
+        <w:t xml:space="preserve">, a local image tagged as v1 was built, the image was pushed to Amazon ECR and a Kubernetes cluster was created on Amazon EKS. After that, ConfigMap, Secret, Deployment and Service YAML manifests </w:t>
       </w:r>
       <w:proofErr w:type="gramStart"/>
       <w:r>
         <w:rPr>
           <w:rFonts w:cs="Arial"/>
         </w:rPr>
-        <w:t>was created</w:t>
+        <w:t>were applied</w:t>
       </w:r>
       <w:proofErr w:type="gramEnd"/>
       <w:r>
         <w:rPr>
           <w:rFonts w:cs="Arial"/>
         </w:rPr>
-        <w:t>, a local image tagged as v1 was built, the</w:t>
-      </w:r>
-      <w:r>
-        <w:rPr>
-          <w:rFonts w:cs="Arial"/>
-        </w:rPr>
-        <w:t xml:space="preserve"> image was pushed to Amazon ECR and a Kubernetes cluster was created on Amazon EKS. After that, ConfigMap, Secret, Deployment and Service YAML manifests </w:t>
-      </w:r>
-      <w:proofErr w:type="gramStart"/>
-      <w:r>
-        <w:rPr>
-          <w:rFonts w:cs="Arial"/>
-        </w:rPr>
-        <w:t>were applied</w:t>
-      </w:r>
-      <w:proofErr w:type="gramEnd"/>
-      <w:r>
-        <w:rPr>
-          <w:rFonts w:cs="Arial"/>
-        </w:rPr>
-        <w:t>, allowing two replicas of the application to run and exposing it through a LoadBalancer. T</w:t>
-      </w:r>
-      <w:r>
-        <w:rPr>
-          <w:rFonts w:cs="Arial"/>
-        </w:rPr>
-        <w:t>he performed tests demonstrated external access, environment variable reading and automatic Pod recovery, meeting the goal of understanding the flow between application, container, image registry and cloud orchestration.</w:t>
+        <w:t>, allowing two replicas of the application to run and exposing it through a LoadBalancer. The performed tests demonstrated external access, environment variable reading and automatic Pod recovery, meeting the goal of understanding the flow between application, container, image registry and cloud orchestration.</w:t>
       </w:r>
     </w:p>
     <w:p>
@@ -316,13 +274,7 @@
         <w:rPr>
           <w:rFonts w:cs="Arial"/>
         </w:rPr>
-        <w:t>Docker. Kubernetes. Amazo</w:t>
-      </w:r>
-      <w:r>
-        <w:rPr>
-          <w:rFonts w:cs="Arial"/>
-        </w:rPr>
-        <w:t>n EKS. Amazon ECR. Spring Boot. Cloud Commerce.</w:t>
+        <w:t>Docker. Kubernetes. Amazon EKS. Amazon ECR. Spring Boot. Cloud Commerce.</w:t>
       </w:r>
     </w:p>
     <w:p>
@@ -1739,6 +1691,227 @@
     </w:p>
     <w:p>
       <w:pPr>
+        <w:pStyle w:val="Ttulo2"/>
+        <w:spacing w:after="120"/>
+      </w:pPr>
+      <w:r>
+        <w:rPr>
+          <w:rFonts w:ascii="Arial" w:hAnsi="Arial" w:cs="Arial"/>
+          <w:sz w:val="24"/>
+        </w:rPr>
+        <w:t>4</w:t>
+      </w:r>
+      <w:r>
+        <w:rPr>
+          <w:rFonts w:ascii="Arial" w:hAnsi="Arial" w:cs="Arial"/>
+          <w:sz w:val="24"/>
+        </w:rPr>
+        <w:t>.1 Fluxos visuais do processo</w:t>
+      </w:r>
+    </w:p>
+    <w:p>
+      <w:pPr>
+        <w:spacing w:after="120" w:line="360" w:lineRule="auto"/>
+        <w:jc w:val="both"/>
+      </w:pPr>
+      <w:r>
+        <w:rPr>
+          <w:rFonts w:cs="Arial"/>
+        </w:rPr>
+        <w:t>Para resumir o caminho feito, foram criados dois fluxos. O primeiro mostra a sequência da aplicação até a imagem publicada e executada no EKS. O segundo mostra a criação do cluster e o papel dos arquivos YAML.</w:t>
+      </w:r>
+    </w:p>
+    <w:p>
+      <w:pPr>
+        <w:keepNext/>
+        <w:jc w:val="center"/>
+      </w:pPr>
+      <w:r>
+        <w:rPr>
+          <w:rFonts w:cs="Arial"/>
+          <w:b/>
+          <w:sz w:val="19"/>
+        </w:rPr>
+        <w:t>Figura 1 - Fluxo</w:t>
+      </w:r>
+      <w:r>
+        <w:rPr>
+          <w:rFonts w:cs="Arial"/>
+          <w:b/>
+          <w:sz w:val="19"/>
+        </w:rPr>
+        <w:t xml:space="preserve"> de ação entre build, Docker, ECR e EKS</w:t>
+      </w:r>
+    </w:p>
+    <w:p>
+      <w:pPr>
+        <w:ind w:hanging="993"/>
+        <w:jc w:val="center"/>
+      </w:pPr>
+      <w:r>
+        <w:rPr>
+          <w:noProof/>
+          <w:lang w:val="pt-BR" w:eastAsia="pt-BR"/>
+        </w:rPr>
+        <w:drawing>
+          <wp:inline distT="0" distB="0" distL="0" distR="0">
+            <wp:extent cx="6647291" cy="2779776"/>
+            <wp:effectExtent l="0" t="0" r="1270" b="1905"/>
+            <wp:docPr id="12" name="Picture 12"/>
+            <wp:cNvGraphicFramePr>
+              <a:graphicFrameLocks xmlns:a="http://schemas.openxmlformats.org/drawingml/2006/main" noChangeAspect="1"/>
+            </wp:cNvGraphicFramePr>
+            <a:graphic xmlns:a="http://schemas.openxmlformats.org/drawingml/2006/main">
+              <a:graphicData uri="http://schemas.openxmlformats.org/drawingml/2006/picture">
+                <pic:pic xmlns:pic="http://schemas.openxmlformats.org/drawingml/2006/picture">
+                  <pic:nvPicPr>
+                    <pic:cNvPr id="0" name="fluxo-build-docker-ecr-eks.png"/>
+                    <pic:cNvPicPr/>
+                  </pic:nvPicPr>
+                  <pic:blipFill>
+                    <a:blip r:embed="rId6"/>
+                    <a:stretch>
+                      <a:fillRect/>
+                    </a:stretch>
+                  </pic:blipFill>
+                  <pic:spPr>
+                    <a:xfrm>
+                      <a:off x="0" y="0"/>
+                      <a:ext cx="6670447" cy="2789459"/>
+                    </a:xfrm>
+                    <a:prstGeom prst="rect">
+                      <a:avLst/>
+                    </a:prstGeom>
+                  </pic:spPr>
+                </pic:pic>
+              </a:graphicData>
+            </a:graphic>
+          </wp:inline>
+        </w:drawing>
+      </w:r>
+    </w:p>
+    <w:p>
+      <w:pPr>
+        <w:jc w:val="center"/>
+      </w:pPr>
+      <w:r>
+        <w:rPr>
+          <w:rFonts w:cs="Arial"/>
+          <w:i/>
+          <w:sz w:val="17"/>
+        </w:rPr>
+        <w:t>Fonte: Elaborado pelo autor, 2026.</w:t>
+      </w:r>
+    </w:p>
+    <w:p>
+      <w:pPr>
+        <w:spacing w:after="120" w:line="360" w:lineRule="auto"/>
+        <w:jc w:val="both"/>
+      </w:pPr>
+      <w:r>
+        <w:rPr>
+          <w:rFonts w:cs="Arial"/>
+        </w:rPr>
+        <w:t>Esse fluxo mostra que o projeto começa no código Spring Boot, passa pelo build Maven, vira imagem Docker, é publicado no Amazon ECR e depois é usado pelo Deployment no Amazon EKS.</w:t>
+      </w:r>
+    </w:p>
+    <w:p>
+      <w:pPr>
+        <w:keepNext/>
+        <w:jc w:val="center"/>
+      </w:pPr>
+      <w:r>
+        <w:rPr>
+          <w:rFonts w:cs="Arial"/>
+          <w:b/>
+          <w:sz w:val="19"/>
+        </w:rPr>
+        <w:lastRenderedPageBreak/>
+        <w:t>Figura 2 - Fluxo de criação do cluster e aplicação dos YAMLs</w:t>
+      </w:r>
+    </w:p>
+    <w:p>
+      <w:pPr>
+        <w:ind w:hanging="1134"/>
+        <w:jc w:val="center"/>
+      </w:pPr>
+      <w:r>
+        <w:rPr>
+          <w:noProof/>
+          <w:lang w:val="pt-BR" w:eastAsia="pt-BR"/>
+        </w:rPr>
+        <w:drawing>
+          <wp:inline distT="0" distB="0" distL="0" distR="0">
+            <wp:extent cx="6925929" cy="3525927"/>
+            <wp:effectExtent l="0" t="0" r="8890" b="0"/>
+            <wp:docPr id="13" name="Picture 13"/>
+            <wp:cNvGraphicFramePr>
+              <a:graphicFrameLocks xmlns:a="http://schemas.openxmlformats.org/drawingml/2006/main" noChangeAspect="1"/>
+            </wp:cNvGraphicFramePr>
+            <a:graphic xmlns:a="http://schemas.openxmlformats.org/drawingml/2006/main">
+              <a:graphicData uri="http://schemas.openxmlformats.org/drawingml/2006/picture">
+                <pic:pic xmlns:pic="http://schemas.openxmlformats.org/drawingml/2006/picture">
+                  <pic:nvPicPr>
+                    <pic:cNvPr id="0" name="fluxo-cluster-yamls-kubernetes.png"/>
+                    <pic:cNvPicPr/>
+                  </pic:nvPicPr>
+                  <pic:blipFill>
+                    <a:blip r:embed="rId7"/>
+                    <a:stretch>
+                      <a:fillRect/>
+                    </a:stretch>
+                  </pic:blipFill>
+                  <pic:spPr>
+                    <a:xfrm>
+                      <a:off x="0" y="0"/>
+                      <a:ext cx="6976629" cy="3551738"/>
+                    </a:xfrm>
+                    <a:prstGeom prst="rect">
+                      <a:avLst/>
+                    </a:prstGeom>
+                  </pic:spPr>
+                </pic:pic>
+              </a:graphicData>
+            </a:graphic>
+          </wp:inline>
+        </w:drawing>
+      </w:r>
+      <w:bookmarkStart w:id="0" w:name="_GoBack"/>
+      <w:bookmarkEnd w:id="0"/>
+    </w:p>
+    <w:p>
+      <w:pPr>
+        <w:jc w:val="center"/>
+      </w:pPr>
+      <w:r>
+        <w:rPr>
+          <w:rFonts w:cs="Arial"/>
+          <w:i/>
+          <w:sz w:val="17"/>
+        </w:rPr>
+        <w:t>Fonte: Elaborado pelo autor, 2026.</w:t>
+      </w:r>
+    </w:p>
+    <w:p>
+      <w:pPr>
+        <w:spacing w:after="120" w:line="360" w:lineRule="auto"/>
+        <w:jc w:val="both"/>
+      </w:pPr>
+      <w:r>
+        <w:rPr>
+          <w:rFonts w:cs="Arial"/>
+        </w:rPr>
+        <w:t>Esse fluxo mostra que o cluster é criado com eksctl, validado com kubectl get nodes e configurado com ConfigMap, Secret, Deployment e Service. Ao final, o Se</w:t>
+      </w:r>
+      <w:r>
+        <w:rPr>
+          <w:rFonts w:cs="Arial"/>
+        </w:rPr>
+        <w:t>rvice LoadBalancer disponibiliza a aplicação.</w:t>
+      </w:r>
+    </w:p>
+    <w:p>
+      <w:pPr>
         <w:pStyle w:val="Ttulo1"/>
         <w:spacing w:before="280" w:after="120"/>
       </w:pPr>
@@ -2086,10 +2259,9 @@
       <w:r>
         <w:rPr>
           <w:rFonts w:cs="Arial"/>
-          <w:b/>
-          <w:sz w:val="19"/>
-        </w:rPr>
-        <w:t>Figura 1 - Imagem Docker local e imagens publicadas no ECR</w:t>
+        </w:rPr>
+        <w:lastRenderedPageBreak/>
+        <w:t>Figura 3 - Imagem Docker local e imagens publicadas no ECR</w:t>
       </w:r>
     </w:p>
     <w:p>
@@ -2117,7 +2289,7 @@
                     <pic:cNvPicPr/>
                   </pic:nvPicPr>
                   <pic:blipFill>
-                    <a:blip r:embed="rId6"/>
+                    <a:blip r:embed="rId8"/>
                     <a:stretch>
                       <a:fillRect/>
                     </a:stretch>
@@ -2254,7 +2426,6 @@
           <w:b/>
           <w:color w:val="0369A1"/>
         </w:rPr>
-        <w:lastRenderedPageBreak/>
         <w:t xml:space="preserve">Explicação rápida: </w:t>
       </w:r>
       <w:r>
@@ -2355,10 +2526,8 @@
       <w:r>
         <w:rPr>
           <w:rFonts w:cs="Arial"/>
-          <w:b/>
-          <w:sz w:val="19"/>
-        </w:rPr>
-        <w:t>Figura 2 - Repositórios privados criados no ECR em São Paulo</w:t>
+        </w:rPr>
+        <w:t>Figura 4 - Repositórios privados criados no ECR em São Paulo</w:t>
       </w:r>
     </w:p>
     <w:p>
@@ -2386,7 +2555,7 @@
                     <pic:cNvPicPr/>
                   </pic:nvPicPr>
                   <pic:blipFill>
-                    <a:blip r:embed="rId7"/>
+                    <a:blip r:embed="rId9"/>
                     <a:stretch>
                       <a:fillRect/>
                     </a:stretch>
@@ -2429,6 +2598,7 @@
         <w:rPr>
           <w:rFonts w:cs="Arial"/>
         </w:rPr>
+        <w:lastRenderedPageBreak/>
         <w:t xml:space="preserve">A captura mostra os repositórios privados do projeto </w:t>
       </w:r>
       <w:proofErr w:type="gramStart"/>
@@ -2454,10 +2624,8 @@
       <w:r>
         <w:rPr>
           <w:rFonts w:cs="Arial"/>
-          <w:b/>
-          <w:sz w:val="19"/>
-        </w:rPr>
-        <w:t>Figura 3 - Tag v1 publicada no repositório cloud-commerce</w:t>
+        </w:rPr>
+        <w:t>Figura 5 - Tag v1 publicada no repositório cloud-commerce</w:t>
       </w:r>
     </w:p>
     <w:p>
@@ -2485,7 +2653,7 @@
                     <pic:cNvPicPr/>
                   </pic:nvPicPr>
                   <pic:blipFill>
-                    <a:blip r:embed="rId8"/>
+                    <a:blip r:embed="rId10"/>
                     <a:stretch>
                       <a:fillRect/>
                     </a:stretch>
@@ -2540,7 +2708,6 @@
         <w:rPr>
           <w:rFonts w:ascii="Arial" w:hAnsi="Arial" w:cs="Arial"/>
         </w:rPr>
-        <w:lastRenderedPageBreak/>
         <w:t>7. Kubernetes e Amazon EKS</w:t>
       </w:r>
     </w:p>
@@ -2984,10 +3151,9 @@
       <w:r>
         <w:rPr>
           <w:rFonts w:cs="Arial"/>
-          <w:b/>
-          <w:sz w:val="19"/>
-        </w:rPr>
-        <w:t>Figura 4 - Cluster cloud-commerce-eks ativo no console AWS</w:t>
+        </w:rPr>
+        <w:lastRenderedPageBreak/>
+        <w:t>Figura 6 - Cluster cloud-commerce-eks ativo no console AWS</w:t>
       </w:r>
     </w:p>
     <w:p>
@@ -3015,7 +3181,7 @@
                     <pic:cNvPicPr/>
                   </pic:nvPicPr>
                   <pic:blipFill>
-                    <a:blip r:embed="rId9"/>
+                    <a:blip r:embed="rId11"/>
                     <a:stretch>
                       <a:fillRect/>
                     </a:stretch>
@@ -3083,10 +3249,8 @@
       <w:r>
         <w:rPr>
           <w:rFonts w:cs="Arial"/>
-          <w:b/>
-          <w:sz w:val="19"/>
-        </w:rPr>
-        <w:t>Figura 5 - Nodes do cluster em estado Ready</w:t>
+        </w:rPr>
+        <w:t>Figura 7 - Nodes do cluster em estado Ready</w:t>
       </w:r>
     </w:p>
     <w:p>
@@ -3114,7 +3278,7 @@
                     <pic:cNvPicPr/>
                   </pic:nvPicPr>
                   <pic:blipFill>
-                    <a:blip r:embed="rId10"/>
+                    <a:blip r:embed="rId12"/>
                     <a:stretch>
                       <a:fillRect/>
                     </a:stretch>
@@ -3157,7 +3321,6 @@
         <w:rPr>
           <w:rFonts w:cs="Arial"/>
         </w:rPr>
-        <w:lastRenderedPageBreak/>
         <w:t>O comando kubectl get nodes mostra dois nodes prontos. A partir desse momento, o kubectl já conseguia conversar com o cluster.</w:t>
       </w:r>
     </w:p>
@@ -3495,10 +3658,9 @@
       <w:r>
         <w:rPr>
           <w:rFonts w:cs="Arial"/>
-          <w:b/>
-          <w:sz w:val="19"/>
-        </w:rPr>
-        <w:t>Figura 6 - Criação dos objetos Kubernetes por kubectl apply</w:t>
+        </w:rPr>
+        <w:lastRenderedPageBreak/>
+        <w:t>Figura 8 - Criação dos objetos Kubernetes por kubectl apply</w:t>
       </w:r>
     </w:p>
     <w:p>
@@ -3526,7 +3688,7 @@
                     <pic:cNvPicPr/>
                   </pic:nvPicPr>
                   <pic:blipFill>
-                    <a:blip r:embed="rId11"/>
+                    <a:blip r:embed="rId13"/>
                     <a:stretch>
                       <a:fillRect/>
                     </a:stretch>
@@ -3594,11 +3756,8 @@
       <w:r>
         <w:rPr>
           <w:rFonts w:cs="Arial"/>
-          <w:b/>
-          <w:sz w:val="19"/>
-        </w:rPr>
-        <w:lastRenderedPageBreak/>
-        <w:t>Figura 7 - Deployment, Pods e Service LoadBalancer</w:t>
+        </w:rPr>
+        <w:t>Figura 9 - Deployment, Pods e Service LoadBalancer</w:t>
       </w:r>
     </w:p>
     <w:p>
@@ -3626,7 +3785,7 @@
                     <pic:cNvPicPr/>
                   </pic:nvPicPr>
                   <pic:blipFill>
-                    <a:blip r:embed="rId12"/>
+                    <a:blip r:embed="rId14"/>
                     <a:stretch>
                       <a:fillRect/>
                     </a:stretch>
@@ -3918,7 +4077,15 @@
                 <w:rFonts w:cs="Arial"/>
                 <w:sz w:val="19"/>
               </w:rPr>
-              <w:t>ConfigMap e Secret chegando no container.</w:t>
+              <w:t xml:space="preserve">ConfigMap e Secret </w:t>
+            </w:r>
+            <w:r>
+              <w:rPr>
+                <w:rFonts w:cs="Arial"/>
+                <w:sz w:val="19"/>
+              </w:rPr>
+              <w:lastRenderedPageBreak/>
+              <w:t>chegando no container.</w:t>
             </w:r>
           </w:p>
         </w:tc>
@@ -3936,6 +4103,7 @@
                 <w:rFonts w:cs="Arial"/>
                 <w:sz w:val="19"/>
               </w:rPr>
+              <w:lastRenderedPageBreak/>
               <w:t>{"ambiente":"demonstracao","apiKeyConfigured":true}</w:t>
             </w:r>
           </w:p>
@@ -3951,10 +4119,8 @@
       <w:r>
         <w:rPr>
           <w:rFonts w:cs="Arial"/>
-          <w:b/>
-          <w:sz w:val="19"/>
-        </w:rPr>
-        <w:t>Figura 8 - Endpoint /health respondendo pelo LoadBalancer</w:t>
+        </w:rPr>
+        <w:t>Figura 10 - Endpoint /health respondendo pelo LoadBalancer</w:t>
       </w:r>
     </w:p>
     <w:p>
@@ -3982,7 +4148,7 @@
                     <pic:cNvPicPr/>
                   </pic:nvPicPr>
                   <pic:blipFill>
-                    <a:blip r:embed="rId13"/>
+                    <a:blip r:embed="rId15"/>
                     <a:stretch>
                       <a:fillRect/>
                     </a:stretch>
@@ -4050,11 +4216,8 @@
       <w:r>
         <w:rPr>
           <w:rFonts w:cs="Arial"/>
-          <w:b/>
-          <w:sz w:val="19"/>
-        </w:rPr>
-        <w:lastRenderedPageBreak/>
-        <w:t>Figura 9 - Endpoint /config validando ConfigMap e Secret</w:t>
+        </w:rPr>
+        <w:t>Figura 11 - Endpoint /config validando ConfigMap e Secret</w:t>
       </w:r>
     </w:p>
     <w:p>
@@ -4082,7 +4245,7 @@
                     <pic:cNvPicPr/>
                   </pic:nvPicPr>
                   <pic:blipFill>
-                    <a:blip r:embed="rId14"/>
+                    <a:blip r:embed="rId16"/>
                     <a:stretch>
                       <a:fillRect/>
                     </a:stretch>
@@ -4150,10 +4313,9 @@
       <w:r>
         <w:rPr>
           <w:rFonts w:cs="Arial"/>
-          <w:b/>
-          <w:sz w:val="19"/>
-        </w:rPr>
-        <w:t>Figura 10 - Front Cloud Commerce acessível pelo navegador</w:t>
+        </w:rPr>
+        <w:lastRenderedPageBreak/>
+        <w:t>Figura 12 - Front Cloud Commerce acessível pelo navegador</w:t>
       </w:r>
     </w:p>
     <w:p>
@@ -4181,7 +4343,7 @@
                     <pic:cNvPicPr/>
                   </pic:nvPicPr>
                   <pic:blipFill>
-                    <a:blip r:embed="rId15"/>
+                    <a:blip r:embed="rId17"/>
                     <a:stretch>
                       <a:fillRect/>
                     </a:stretch>
@@ -4279,7 +4441,6 @@
           <w:rFonts w:cs="Consolas"/>
           <w:sz w:val="16"/>
         </w:rPr>
-        <w:lastRenderedPageBreak/>
         <w:t>kubectl</w:t>
       </w:r>
       <w:proofErr w:type="gramEnd"/>
@@ -4315,10 +4476,8 @@
       <w:r>
         <w:rPr>
           <w:rFonts w:cs="Arial"/>
-          <w:b/>
-          <w:sz w:val="19"/>
-        </w:rPr>
-        <w:t>Figura 11 - Pod apagado e recriado automaticamente</w:t>
+        </w:rPr>
+        <w:t>Figura 13 - Pod apagado e recriado automaticamente</w:t>
       </w:r>
     </w:p>
     <w:p>
@@ -4346,7 +4505,7 @@
                     <pic:cNvPicPr/>
                   </pic:nvPicPr>
                   <pic:blipFill>
-                    <a:blip r:embed="rId16"/>
+                    <a:blip r:embed="rId18"/>
                     <a:stretch>
                       <a:fillRect/>
                     </a:stretch>
@@ -4423,6 +4582,7 @@
         <w:rPr>
           <w:rFonts w:ascii="Arial" w:hAnsi="Arial" w:cs="Arial"/>
         </w:rPr>
+        <w:lastRenderedPageBreak/>
         <w:t>11. Pontos de atenção e custos</w:t>
       </w:r>
     </w:p>
@@ -4977,7 +5137,6 @@
         <w:rPr>
           <w:rFonts w:cs="Arial"/>
         </w:rPr>
-        <w:lastRenderedPageBreak/>
         <w:t xml:space="preserve">O teste de apagar um Pod mostrou </w:t>
       </w:r>
       <w:proofErr w:type="gramStart"/>
@@ -5202,9 +5361,8 @@
             <w:r>
               <w:rPr>
                 <w:rFonts w:cs="Arial"/>
-                <w:sz w:val="19"/>
               </w:rPr>
-              <w:t>Figura 1</w:t>
+              <w:t>Figura 3</w:t>
             </w:r>
           </w:p>
         </w:tc>
@@ -5261,9 +5419,8 @@
             <w:r>
               <w:rPr>
                 <w:rFonts w:cs="Arial"/>
-                <w:sz w:val="19"/>
               </w:rPr>
-              <w:t>Figuras 2 e 3</w:t>
+              <w:t>Figuras 4 e 5</w:t>
             </w:r>
           </w:p>
         </w:tc>
@@ -5320,9 +5477,8 @@
             <w:r>
               <w:rPr>
                 <w:rFonts w:cs="Arial"/>
-                <w:sz w:val="19"/>
               </w:rPr>
-              <w:t>Figura 4</w:t>
+              <w:t>Figura 6</w:t>
             </w:r>
           </w:p>
         </w:tc>
@@ -5379,9 +5535,8 @@
             <w:r>
               <w:rPr>
                 <w:rFonts w:cs="Arial"/>
-                <w:sz w:val="19"/>
               </w:rPr>
-              <w:t>Figura 5</w:t>
+              <w:t>Figura 7</w:t>
             </w:r>
           </w:p>
         </w:tc>
@@ -5438,9 +5593,8 @@
             <w:r>
               <w:rPr>
                 <w:rFonts w:cs="Arial"/>
-                <w:sz w:val="19"/>
               </w:rPr>
-              <w:t>Figura 7</w:t>
+              <w:t>Figura 9</w:t>
             </w:r>
           </w:p>
         </w:tc>
@@ -5497,9 +5651,8 @@
             <w:r>
               <w:rPr>
                 <w:rFonts w:cs="Arial"/>
-                <w:sz w:val="19"/>
               </w:rPr>
-              <w:t>Figura 7</w:t>
+              <w:t>Figura 9</w:t>
             </w:r>
           </w:p>
         </w:tc>
@@ -5556,9 +5709,8 @@
             <w:r>
               <w:rPr>
                 <w:rFonts w:cs="Arial"/>
-                <w:sz w:val="19"/>
               </w:rPr>
-              <w:t>Figura 9</w:t>
+              <w:t>Figura 11</w:t>
             </w:r>
           </w:p>
         </w:tc>
@@ -5615,9 +5767,8 @@
             <w:r>
               <w:rPr>
                 <w:rFonts w:cs="Arial"/>
-                <w:sz w:val="19"/>
               </w:rPr>
-              <w:t>Figuras 8 e 10</w:t>
+              <w:t>Figuras 10 e 12</w:t>
             </w:r>
           </w:p>
         </w:tc>
@@ -5674,9 +5825,8 @@
             <w:r>
               <w:rPr>
                 <w:rFonts w:cs="Arial"/>
-                <w:sz w:val="19"/>
               </w:rPr>
-              <w:t>Figura 11</w:t>
+              <w:t>Figura 13</w:t>
             </w:r>
           </w:p>
         </w:tc>
@@ -5993,8 +6143,6 @@
         <w:br/>
         <w:t xml:space="preserve">  --name cloud-commerce-eks `</w:t>
       </w:r>
-      <w:bookmarkStart w:id="0" w:name="_GoBack"/>
-      <w:bookmarkEnd w:id="0"/>
       <w:r>
         <w:rPr>
           <w:rFonts w:cs="Consolas"/>
@@ -6092,7 +6240,6 @@
         <w:rPr>
           <w:rFonts w:ascii="Arial" w:hAnsi="Arial" w:cs="Arial"/>
         </w:rPr>
-        <w:lastRenderedPageBreak/>
         <w:t>Apêndice B - Manifestos Kubernetes</w:t>
       </w:r>
     </w:p>
@@ -6297,6 +6444,13 @@
           <w:sz w:val="16"/>
         </w:rPr>
         <w:br/>
+      </w:r>
+      <w:r>
+        <w:rPr>
+          <w:rFonts w:cs="Consolas"/>
+          <w:sz w:val="16"/>
+        </w:rPr>
+        <w:lastRenderedPageBreak/>
         <w:t>metadata:</w:t>
       </w:r>
       <w:r>
@@ -6638,13 +6792,6 @@
           <w:sz w:val="16"/>
         </w:rPr>
         <w:br/>
-      </w:r>
-      <w:r>
-        <w:rPr>
-          <w:rFonts w:cs="Consolas"/>
-          <w:sz w:val="16"/>
-        </w:rPr>
-        <w:lastRenderedPageBreak/>
         <w:t>metadata:</w:t>
       </w:r>
       <w:r>
@@ -19348,7 +19495,7 @@
 </file>
 
 <file path=customXml/itemProps1.xml><?xml version="1.0" encoding="utf-8"?>
-<ds:datastoreItem xmlns:ds="http://schemas.openxmlformats.org/officeDocument/2006/customXml" ds:itemID="{31E23554-723D-43B9-96C8-8422952AD1F7}">
+<ds:datastoreItem xmlns:ds="http://schemas.openxmlformats.org/officeDocument/2006/customXml" ds:itemID="{67115FBC-408F-4475-B84B-C814A3002178}">
   <ds:schemaRefs>
     <ds:schemaRef ds:uri="http://schemas.openxmlformats.org/officeDocument/2006/bibliography"/>
   </ds:schemaRefs>

</xml_diff>

<commit_message>
Commit Evidencia Final AWS
</commit_message>
<xml_diff>
--- a/docs/trabalho-aws-abnt.docx
+++ b/docs/trabalho-aws-abnt.docx
@@ -1699,14 +1699,7 @@
           <w:rFonts w:ascii="Arial" w:hAnsi="Arial" w:cs="Arial"/>
           <w:sz w:val="24"/>
         </w:rPr>
-        <w:t>4</w:t>
-      </w:r>
-      <w:r>
-        <w:rPr>
-          <w:rFonts w:ascii="Arial" w:hAnsi="Arial" w:cs="Arial"/>
-          <w:sz w:val="24"/>
-        </w:rPr>
-        <w:t>.1 Fluxos visuais do processo</w:t>
+        <w:t>4.1 Fluxos visuais do processo</w:t>
       </w:r>
     </w:p>
     <w:p>
@@ -1732,15 +1725,7 @@
           <w:b/>
           <w:sz w:val="19"/>
         </w:rPr>
-        <w:t>Figura 1 - Fluxo</w:t>
-      </w:r>
-      <w:r>
-        <w:rPr>
-          <w:rFonts w:cs="Arial"/>
-          <w:b/>
-          <w:sz w:val="19"/>
-        </w:rPr>
-        <w:t xml:space="preserve"> de ação entre build, Docker, ECR e EKS</w:t>
+        <w:t>Figura 1 - Fluxo de ação entre build, Docker, ECR e EKS</w:t>
       </w:r>
     </w:p>
     <w:p>
@@ -1876,8 +1861,6 @@
           </wp:inline>
         </w:drawing>
       </w:r>
-      <w:bookmarkStart w:id="0" w:name="_GoBack"/>
-      <w:bookmarkEnd w:id="0"/>
     </w:p>
     <w:p>
       <w:pPr>
@@ -1901,13 +1884,7 @@
         <w:rPr>
           <w:rFonts w:cs="Arial"/>
         </w:rPr>
-        <w:t>Esse fluxo mostra que o cluster é criado com eksctl, validado com kubectl get nodes e configurado com ConfigMap, Secret, Deployment e Service. Ao final, o Se</w:t>
-      </w:r>
-      <w:r>
-        <w:rPr>
-          <w:rFonts w:cs="Arial"/>
-        </w:rPr>
-        <w:t>rvice LoadBalancer disponibiliza a aplicação.</w:t>
+        <w:t>Esse fluxo mostra que o cluster é criado com eksctl, validado com kubectl get nodes e configurado com ConfigMap, Secret, Deployment e Service. Ao final, o Service LoadBalancer disponibiliza a aplicação.</w:t>
       </w:r>
     </w:p>
     <w:p>
@@ -5076,6 +5053,105 @@
     </w:p>
     <w:p>
       <w:pPr>
+        <w:keepNext/>
+        <w:jc w:val="center"/>
+      </w:pPr>
+      <w:r>
+        <w:rPr>
+          <w:rFonts w:cs="Arial"/>
+          <w:b/>
+          <w:sz w:val="19"/>
+        </w:rPr>
+        <w:t>Figur</w:t>
+      </w:r>
+      <w:r>
+        <w:rPr>
+          <w:rFonts w:cs="Arial"/>
+          <w:b/>
+          <w:sz w:val="19"/>
+        </w:rPr>
+        <w:t>a 14 - Verificação final de limpeza dos recursos AWS</w:t>
+      </w:r>
+    </w:p>
+    <w:p>
+      <w:pPr>
+        <w:jc w:val="center"/>
+      </w:pPr>
+      <w:r>
+        <w:rPr>
+          <w:noProof/>
+          <w:lang w:val="pt-BR" w:eastAsia="pt-BR"/>
+        </w:rPr>
+        <w:drawing>
+          <wp:inline distT="0" distB="0" distL="0" distR="0">
+            <wp:extent cx="3780000" cy="3570830"/>
+            <wp:effectExtent l="0" t="0" r="0" b="0"/>
+            <wp:docPr id="14" name="Picture 14"/>
+            <wp:cNvGraphicFramePr>
+              <a:graphicFrameLocks xmlns:a="http://schemas.openxmlformats.org/drawingml/2006/main" noChangeAspect="1"/>
+            </wp:cNvGraphicFramePr>
+            <a:graphic xmlns:a="http://schemas.openxmlformats.org/drawingml/2006/main">
+              <a:graphicData uri="http://schemas.openxmlformats.org/drawingml/2006/picture">
+                <pic:pic xmlns:pic="http://schemas.openxmlformats.org/drawingml/2006/picture">
+                  <pic:nvPicPr>
+                    <pic:cNvPr id="0" name="codex-clipboard-febe02bb-995a-4d07-a0c9-4e1996f40ecf.png"/>
+                    <pic:cNvPicPr/>
+                  </pic:nvPicPr>
+                  <pic:blipFill>
+                    <a:blip r:embed="rId19"/>
+                    <a:stretch>
+                      <a:fillRect/>
+                    </a:stretch>
+                  </pic:blipFill>
+                  <pic:spPr>
+                    <a:xfrm>
+                      <a:off x="0" y="0"/>
+                      <a:ext cx="3780000" cy="3570830"/>
+                    </a:xfrm>
+                    <a:prstGeom prst="rect">
+                      <a:avLst/>
+                    </a:prstGeom>
+                  </pic:spPr>
+                </pic:pic>
+              </a:graphicData>
+            </a:graphic>
+          </wp:inline>
+        </w:drawing>
+      </w:r>
+    </w:p>
+    <w:p>
+      <w:pPr>
+        <w:jc w:val="center"/>
+      </w:pPr>
+      <w:r>
+        <w:rPr>
+          <w:rFonts w:cs="Arial"/>
+          <w:i/>
+          <w:sz w:val="17"/>
+        </w:rPr>
+        <w:t>Fonte: Captura de tela do ambiente do autor, 2026.</w:t>
+      </w:r>
+    </w:p>
+    <w:p>
+      <w:pPr>
+        <w:spacing w:after="120" w:line="360" w:lineRule="auto"/>
+        <w:jc w:val="both"/>
+      </w:pPr>
+      <w:r>
+        <w:rPr>
+          <w:rFonts w:cs="Arial"/>
+        </w:rPr>
+        <w:t xml:space="preserve">A verificação final nas regiões sa-east-1 e us-east-1 não retornou clusters EKS, instâncias EC2, LoadBalancers, volumes EBS soltos, Elastic IPs ou </w:t>
+      </w:r>
+      <w:r>
+        <w:rPr>
+          <w:rFonts w:cs="Arial"/>
+        </w:rPr>
+        <w:t>repositórios ECR ativos.</w:t>
+      </w:r>
+    </w:p>
+    <w:p>
+      <w:pPr>
         <w:pStyle w:val="Ttulo1"/>
         <w:spacing w:before="280" w:after="120"/>
       </w:pPr>
@@ -5083,6 +5159,7 @@
         <w:rPr>
           <w:rFonts w:ascii="Arial" w:hAnsi="Arial" w:cs="Arial"/>
         </w:rPr>
+        <w:lastRenderedPageBreak/>
         <w:t>12. Conclusão</w:t>
       </w:r>
     </w:p>
@@ -5859,14 +5936,7 @@
             <w:vAlign w:val="center"/>
           </w:tcPr>
           <w:p>
-            <w:pPr>
-              <w:spacing w:after="0" w:line="252" w:lineRule="auto"/>
-            </w:pPr>
             <w:r>
-              <w:rPr>
-                <w:rFonts w:cs="Arial"/>
-                <w:sz w:val="19"/>
-              </w:rPr>
               <w:t>Feito</w:t>
             </w:r>
           </w:p>
@@ -5877,15 +5947,8 @@
             <w:vAlign w:val="center"/>
           </w:tcPr>
           <w:p>
-            <w:pPr>
-              <w:spacing w:after="0" w:line="252" w:lineRule="auto"/>
-            </w:pPr>
             <w:r>
-              <w:rPr>
-                <w:rFonts w:cs="Arial"/>
-                <w:sz w:val="19"/>
-              </w:rPr>
-              <w:t>Sem pois seriam muitas imagens</w:t>
+              <w:t>Figura 14</w:t>
             </w:r>
           </w:p>
         </w:tc>
@@ -6128,18 +6191,27 @@
         <w:spacing w:before="40" w:after="160"/>
         <w:ind w:left="227" w:right="57"/>
       </w:pPr>
+      <w:proofErr w:type="gramStart"/>
       <w:r>
         <w:rPr>
           <w:rFonts w:cs="Consolas"/>
           <w:sz w:val="16"/>
         </w:rPr>
-        <w:t>eksctl create cluster `</w:t>
-      </w:r>
+        <w:t>eksctl</w:t>
+      </w:r>
+      <w:proofErr w:type="gramEnd"/>
       <w:r>
         <w:rPr>
           <w:rFonts w:cs="Consolas"/>
           <w:sz w:val="16"/>
         </w:rPr>
+        <w:t xml:space="preserve"> create cluster `</w:t>
+      </w:r>
+      <w:r>
+        <w:rPr>
+          <w:rFonts w:cs="Consolas"/>
+          <w:sz w:val="16"/>
+        </w:rPr>
         <w:br/>
         <w:t xml:space="preserve">  --name cloud-commerce-eks `</w:t>
       </w:r>
@@ -6149,13 +6221,20 @@
           <w:sz w:val="16"/>
         </w:rPr>
         <w:br/>
-        <w:t xml:space="preserve">  --region sa-east-1 `</w:t>
       </w:r>
       <w:r>
         <w:rPr>
           <w:rFonts w:cs="Consolas"/>
           <w:sz w:val="16"/>
         </w:rPr>
+        <w:lastRenderedPageBreak/>
+        <w:t xml:space="preserve">  --region sa-east-1 `</w:t>
+      </w:r>
+      <w:r>
+        <w:rPr>
+          <w:rFonts w:cs="Consolas"/>
+          <w:sz w:val="16"/>
+        </w:rPr>
         <w:br/>
         <w:t xml:space="preserve">  --version 1.36 `</w:t>
       </w:r>
@@ -6188,7 +6267,23 @@
           <w:sz w:val="16"/>
         </w:rPr>
         <w:br/>
-        <w:t>Set-Location "C:\Users\sirius.alves\Projetos\microservicoscommerce"</w:t>
+        <w:t>Set-Location "</w:t>
+      </w:r>
+      <w:r>
+        <w:rPr>
+          <w:rFonts w:cs="Consolas"/>
+          <w:sz w:val="16"/>
+        </w:rPr>
+        <w:t>"$HOME</w:t>
+      </w:r>
+      <w:bookmarkStart w:id="0" w:name="_GoBack"/>
+      <w:bookmarkEnd w:id="0"/>
+      <w:r>
+        <w:rPr>
+          <w:rFonts w:cs="Consolas"/>
+          <w:sz w:val="16"/>
+        </w:rPr>
+        <w:t>\Projetos\microservicoscommerce"</w:t>
       </w:r>
       <w:r>
         <w:rPr>
@@ -6444,14 +6539,15 @@
           <w:sz w:val="16"/>
         </w:rPr>
         <w:br/>
+        <w:t>metadata:</w:t>
       </w:r>
       <w:r>
         <w:rPr>
           <w:rFonts w:cs="Consolas"/>
           <w:sz w:val="16"/>
         </w:rPr>
-        <w:lastRenderedPageBreak/>
-        <w:t>metadata:</w:t>
+        <w:br/>
+        <w:t xml:space="preserve">  name: cloud-commerce</w:t>
       </w:r>
       <w:r>
         <w:rPr>
@@ -6459,7 +6555,7 @@
           <w:sz w:val="16"/>
         </w:rPr>
         <w:br/>
-        <w:t xml:space="preserve">  name: cloud-commerce</w:t>
+        <w:t>spec:</w:t>
       </w:r>
       <w:r>
         <w:rPr>
@@ -6467,7 +6563,7 @@
           <w:sz w:val="16"/>
         </w:rPr>
         <w:br/>
-        <w:t>spec:</w:t>
+        <w:t xml:space="preserve">  replicas: 2</w:t>
       </w:r>
       <w:r>
         <w:rPr>
@@ -6475,7 +6571,7 @@
           <w:sz w:val="16"/>
         </w:rPr>
         <w:br/>
-        <w:t xml:space="preserve">  replicas: 2</w:t>
+        <w:t xml:space="preserve">  selector:</w:t>
       </w:r>
       <w:r>
         <w:rPr>
@@ -6483,7 +6579,7 @@
           <w:sz w:val="16"/>
         </w:rPr>
         <w:br/>
-        <w:t xml:space="preserve">  selector:</w:t>
+        <w:t xml:space="preserve">    matchLabels:</w:t>
       </w:r>
       <w:r>
         <w:rPr>
@@ -6491,7 +6587,7 @@
           <w:sz w:val="16"/>
         </w:rPr>
         <w:br/>
-        <w:t xml:space="preserve">    matchLabels:</w:t>
+        <w:t xml:space="preserve">      app: cloud-commerce</w:t>
       </w:r>
       <w:r>
         <w:rPr>
@@ -6499,7 +6595,7 @@
           <w:sz w:val="16"/>
         </w:rPr>
         <w:br/>
-        <w:t xml:space="preserve">      app: cloud-commerce</w:t>
+        <w:t xml:space="preserve">  template:</w:t>
       </w:r>
       <w:r>
         <w:rPr>
@@ -6507,7 +6603,7 @@
           <w:sz w:val="16"/>
         </w:rPr>
         <w:br/>
-        <w:t xml:space="preserve">  template:</w:t>
+        <w:t xml:space="preserve">    metadata:</w:t>
       </w:r>
       <w:r>
         <w:rPr>
@@ -6515,7 +6611,7 @@
           <w:sz w:val="16"/>
         </w:rPr>
         <w:br/>
-        <w:t xml:space="preserve">    metadata:</w:t>
+        <w:t xml:space="preserve">      labels:</w:t>
       </w:r>
       <w:r>
         <w:rPr>
@@ -6523,7 +6619,7 @@
           <w:sz w:val="16"/>
         </w:rPr>
         <w:br/>
-        <w:t xml:space="preserve">      labels:</w:t>
+        <w:t xml:space="preserve">        app: cloud-commerce</w:t>
       </w:r>
       <w:r>
         <w:rPr>
@@ -6531,7 +6627,7 @@
           <w:sz w:val="16"/>
         </w:rPr>
         <w:br/>
-        <w:t xml:space="preserve">        app: cloud-commerce</w:t>
+        <w:t xml:space="preserve">    spec:</w:t>
       </w:r>
       <w:r>
         <w:rPr>
@@ -6539,7 +6635,7 @@
           <w:sz w:val="16"/>
         </w:rPr>
         <w:br/>
-        <w:t xml:space="preserve">    spec:</w:t>
+        <w:t xml:space="preserve">      containers:</w:t>
       </w:r>
       <w:r>
         <w:rPr>
@@ -6547,7 +6643,7 @@
           <w:sz w:val="16"/>
         </w:rPr>
         <w:br/>
-        <w:t xml:space="preserve">      containers:</w:t>
+        <w:t xml:space="preserve">        - name: cloud-commerce</w:t>
       </w:r>
       <w:r>
         <w:rPr>
@@ -6555,7 +6651,7 @@
           <w:sz w:val="16"/>
         </w:rPr>
         <w:br/>
-        <w:t xml:space="preserve">        - name: cloud-commerce</w:t>
+        <w:t xml:space="preserve">          image: 382597877252.dkr.ecr.sa-east-1.amazonaws.com/microservicoscommerce-cloud-commerce:v1</w:t>
       </w:r>
       <w:r>
         <w:rPr>
@@ -6563,7 +6659,7 @@
           <w:sz w:val="16"/>
         </w:rPr>
         <w:br/>
-        <w:t xml:space="preserve">          image: 382597877252.dkr.ecr.sa-east-1.amazonaws.com/microservicoscommerce-cloud-commerce:v1</w:t>
+        <w:t xml:space="preserve">          imagePullPolicy: Always</w:t>
       </w:r>
       <w:r>
         <w:rPr>
@@ -6571,7 +6667,7 @@
           <w:sz w:val="16"/>
         </w:rPr>
         <w:br/>
-        <w:t xml:space="preserve">          imagePullPolicy: Always</w:t>
+        <w:t xml:space="preserve">          ports:</w:t>
       </w:r>
       <w:r>
         <w:rPr>
@@ -6579,7 +6675,7 @@
           <w:sz w:val="16"/>
         </w:rPr>
         <w:br/>
-        <w:t xml:space="preserve">          ports:</w:t>
+        <w:t xml:space="preserve">            - containerPort: 8081</w:t>
       </w:r>
       <w:r>
         <w:rPr>
@@ -6587,7 +6683,7 @@
           <w:sz w:val="16"/>
         </w:rPr>
         <w:br/>
-        <w:t xml:space="preserve">            - containerPort: 8081</w:t>
+        <w:t xml:space="preserve">          env:</w:t>
       </w:r>
       <w:r>
         <w:rPr>
@@ -6595,7 +6691,7 @@
           <w:sz w:val="16"/>
         </w:rPr>
         <w:br/>
-        <w:t xml:space="preserve">          env:</w:t>
+        <w:t xml:space="preserve">            - name: AMBIENTE</w:t>
       </w:r>
       <w:r>
         <w:rPr>
@@ -6603,7 +6699,7 @@
           <w:sz w:val="16"/>
         </w:rPr>
         <w:br/>
-        <w:t xml:space="preserve">            - name: AMBIENTE</w:t>
+        <w:t xml:space="preserve">              valueFrom:</w:t>
       </w:r>
       <w:r>
         <w:rPr>
@@ -6611,7 +6707,7 @@
           <w:sz w:val="16"/>
         </w:rPr>
         <w:br/>
-        <w:t xml:space="preserve">              valueFrom:</w:t>
+        <w:t xml:space="preserve">                configMapKeyRef:</w:t>
       </w:r>
       <w:r>
         <w:rPr>
@@ -6619,7 +6715,7 @@
           <w:sz w:val="16"/>
         </w:rPr>
         <w:br/>
-        <w:t xml:space="preserve">                configMapKeyRef:</w:t>
+        <w:t xml:space="preserve">                  name: cloud-commerce-config</w:t>
       </w:r>
       <w:r>
         <w:rPr>
@@ -6627,7 +6723,7 @@
           <w:sz w:val="16"/>
         </w:rPr>
         <w:br/>
-        <w:t xml:space="preserve">                  name: cloud-commerce-config</w:t>
+        <w:t xml:space="preserve">                  key: AMBIENTE</w:t>
       </w:r>
       <w:r>
         <w:rPr>
@@ -6635,7 +6731,7 @@
           <w:sz w:val="16"/>
         </w:rPr>
         <w:br/>
-        <w:t xml:space="preserve">                  key: AMBIENTE</w:t>
+        <w:t xml:space="preserve">            - name: API_KEY</w:t>
       </w:r>
       <w:r>
         <w:rPr>
@@ -6643,7 +6739,7 @@
           <w:sz w:val="16"/>
         </w:rPr>
         <w:br/>
-        <w:t xml:space="preserve">            - name: API_KEY</w:t>
+        <w:t xml:space="preserve">              valueFrom:</w:t>
       </w:r>
       <w:r>
         <w:rPr>
@@ -6651,7 +6747,7 @@
           <w:sz w:val="16"/>
         </w:rPr>
         <w:br/>
-        <w:t xml:space="preserve">              valueFrom:</w:t>
+        <w:t xml:space="preserve">                secretKeyRef:</w:t>
       </w:r>
       <w:r>
         <w:rPr>
@@ -6659,7 +6755,7 @@
           <w:sz w:val="16"/>
         </w:rPr>
         <w:br/>
-        <w:t xml:space="preserve">                secretKeyRef:</w:t>
+        <w:t xml:space="preserve">                  name: cloud-commerce-secret</w:t>
       </w:r>
       <w:r>
         <w:rPr>
@@ -6667,7 +6763,7 @@
           <w:sz w:val="16"/>
         </w:rPr>
         <w:br/>
-        <w:t xml:space="preserve">                  name: cloud-commerce-secret</w:t>
+        <w:t xml:space="preserve">                  key: API_KEY</w:t>
       </w:r>
       <w:r>
         <w:rPr>
@@ -6675,14 +6771,13 @@
           <w:sz w:val="16"/>
         </w:rPr>
         <w:br/>
-        <w:t xml:space="preserve">                  key: API_KEY</w:t>
       </w:r>
       <w:r>
         <w:rPr>
           <w:rFonts w:cs="Consolas"/>
           <w:sz w:val="16"/>
         </w:rPr>
-        <w:br/>
+        <w:lastRenderedPageBreak/>
         <w:t xml:space="preserve">          livenessProbe:</w:t>
       </w:r>
       <w:r>
@@ -19495,7 +19590,7 @@
 </file>
 
 <file path=customXml/itemProps1.xml><?xml version="1.0" encoding="utf-8"?>
-<ds:datastoreItem xmlns:ds="http://schemas.openxmlformats.org/officeDocument/2006/customXml" ds:itemID="{67115FBC-408F-4475-B84B-C814A3002178}">
+<ds:datastoreItem xmlns:ds="http://schemas.openxmlformats.org/officeDocument/2006/customXml" ds:itemID="{0B2264C3-A8A4-4A59-8B1F-76D18EA0488E}">
   <ds:schemaRefs>
     <ds:schemaRef ds:uri="http://schemas.openxmlformats.org/officeDocument/2006/bibliography"/>
   </ds:schemaRefs>

</xml_diff>